<commit_message>
normalize section 4.1 mathematical notation
</commit_message>
<xml_diff>
--- a/artifacts/documents/4.1问题描述与空地协同保障机制设计.docx
+++ b/artifacts/documents/4.1问题描述与空地协同保障机制设计.docx
@@ -568,6 +568,10 @@
           </m:e>
           <m:sub>
             <m:r>
+              <m:rPr>
+                <w:rFonts w:ascii="Cambria Math" w:hAnsi="Cambria Math" w:eastAsia="Cambria Math" w:cs="Cambria Math"/>
+                <m:sty m:val="p"/>
+              </m:rPr>
               <m:t>u</m:t>
             </m:r>
           </m:sub>
@@ -649,6 +653,10 @@
           </m:sub>
           <m:sup>
             <m:r>
+              <m:rPr>
+                <w:rFonts w:ascii="Cambria Math" w:hAnsi="Cambria Math" w:eastAsia="Cambria Math" w:cs="Cambria Math"/>
+                <m:sty m:val="p"/>
+              </m:rPr>
               <m:t>u</m:t>
             </m:r>
           </m:sup>
@@ -670,7 +678,7 @@
           <w:color w:val="000000"/>
           <w:sz w:val="24"/>
         </w:rPr>
-        <w:t xml:space="preserve">表示时刻</w:t>
+        <w:t xml:space="preserve">表示其在时刻</w:t>
       </w:r>
       <w:r>
         <w:rPr>
@@ -782,7 +790,21 @@
                 <w:rFonts w:ascii="Cambria Math" w:hAnsi="Cambria Math" w:eastAsia="Cambria Math" w:cs="Cambria Math"/>
                 <m:sty m:val="p"/>
               </m:rPr>
-              <m:t>max</m:t>
+              <m:t>m</m:t>
+            </m:r>
+            <m:r>
+              <m:rPr>
+                <w:rFonts w:ascii="Cambria Math" w:hAnsi="Cambria Math" w:eastAsia="Cambria Math" w:cs="Cambria Math"/>
+                <m:sty m:val="p"/>
+              </m:rPr>
+              <m:t>a</m:t>
+            </m:r>
+            <m:r>
+              <m:rPr>
+                <w:rFonts w:ascii="Cambria Math" w:hAnsi="Cambria Math" w:eastAsia="Cambria Math" w:cs="Cambria Math"/>
+                <m:sty m:val="p"/>
+              </m:rPr>
+              <m:t>x</m:t>
             </m:r>
           </m:sup>
         </m:sSubSup>
@@ -803,7 +825,7 @@
           <w:color w:val="000000"/>
           <w:sz w:val="24"/>
         </w:rPr>
-        <w:t xml:space="preserve">分别表示其剩余药液量和载药容量，单位均为</w:t>
+        <w:t xml:space="preserve">分别表示其剩余药液量和额定载药容量，二者单位均为</w:t>
       </w:r>
       <w:r>
         <w:rPr>
@@ -862,6 +884,10 @@
           </m:e>
           <m:sup>
             <m:r>
+              <m:rPr>
+                <w:rFonts w:ascii="Cambria Math" w:hAnsi="Cambria Math" w:eastAsia="Cambria Math" w:cs="Cambria Math"/>
+                <m:sty m:val="p"/>
+              </m:rPr>
               <m:t>r</m:t>
             </m:r>
           </m:sup>
@@ -893,6 +919,10 @@
           </m:e>
           <m:sup>
             <m:r>
+              <m:rPr>
+                <w:rFonts w:ascii="Cambria Math" w:hAnsi="Cambria Math" w:eastAsia="Cambria Math" w:cs="Cambria Math"/>
+                <m:sty m:val="p"/>
+              </m:rPr>
               <m:t>r</m:t>
             </m:r>
           </m:sup>
@@ -917,6 +947,10 @@
           </m:e>
           <m:sup>
             <m:r>
+              <m:rPr>
+                <w:rFonts w:ascii="Cambria Math" w:hAnsi="Cambria Math" w:eastAsia="Cambria Math" w:cs="Cambria Math"/>
+                <m:sty m:val="p"/>
+              </m:rPr>
               <m:t>r</m:t>
             </m:r>
           </m:sup>
@@ -961,6 +995,10 @@
           </m:e>
           <m:sup>
             <m:r>
+              <m:rPr>
+                <w:rFonts w:ascii="Cambria Math" w:hAnsi="Cambria Math" w:eastAsia="Cambria Math" w:cs="Cambria Math"/>
+                <m:sty m:val="p"/>
+              </m:rPr>
               <m:t>r</m:t>
             </m:r>
           </m:sup>
@@ -998,6 +1036,10 @@
           </m:e>
           <m:sup>
             <m:r>
+              <m:rPr>
+                <w:rFonts w:ascii="Cambria Math" w:hAnsi="Cambria Math" w:eastAsia="Cambria Math" w:cs="Cambria Math"/>
+                <m:sty m:val="p"/>
+              </m:rPr>
               <m:t>r</m:t>
             </m:r>
           </m:sup>
@@ -1095,6 +1137,10 @@
           </m:e>
           <m:sub>
             <m:r>
+              <m:rPr>
+                <w:rFonts w:ascii="Cambria Math" w:hAnsi="Cambria Math" w:eastAsia="Cambria Math" w:cs="Cambria Math"/>
+                <m:sty m:val="p"/>
+              </m:rPr>
               <m:t>v</m:t>
             </m:r>
           </m:sub>
@@ -1217,6 +1263,10 @@
           </m:sub>
           <m:sup>
             <m:r>
+              <m:rPr>
+                <w:rFonts w:ascii="Cambria Math" w:hAnsi="Cambria Math" w:eastAsia="Cambria Math" w:cs="Cambria Math"/>
+                <m:sty m:val="p"/>
+              </m:rPr>
               <m:t>g</m:t>
             </m:r>
           </m:sup>
@@ -3296,6 +3346,10 @@
           </m:e>
           <m:sup>
             <m:r>
+              <m:rPr>
+                <w:rFonts w:ascii="Cambria Math" w:hAnsi="Cambria Math" w:eastAsia="Cambria Math" w:cs="Cambria Math"/>
+                <m:sty m:val="p"/>
+              </m:rPr>
               <m:t>r</m:t>
             </m:r>
           </m:sup>
@@ -3431,6 +3485,10 @@
           </m:e>
           <m:sub>
             <m:r>
+              <m:rPr>
+                <w:rFonts w:ascii="Cambria Math" w:hAnsi="Cambria Math" w:eastAsia="Cambria Math" w:cs="Cambria Math"/>
+                <m:sty m:val="p"/>
+              </m:rPr>
               <m:t>u</m:t>
             </m:r>
           </m:sub>
@@ -3469,6 +3527,10 @@
           </m:sub>
           <m:sup>
             <m:r>
+              <m:rPr>
+                <w:rFonts w:ascii="Cambria Math" w:hAnsi="Cambria Math" w:eastAsia="Cambria Math" w:cs="Cambria Math"/>
+                <m:sty m:val="p"/>
+              </m:rPr>
               <m:t>u</m:t>
             </m:r>
           </m:sup>
@@ -3530,6 +3592,10 @@
               </m:e>
               <m:sup>
                 <m:r>
+                  <m:rPr>
+                    <w:rFonts w:ascii="Cambria Math" w:hAnsi="Cambria Math" w:eastAsia="Cambria Math" w:cs="Cambria Math"/>
+                    <m:sty m:val="p"/>
+                  </m:rPr>
                   <m:t>r</m:t>
                 </m:r>
               </m:sup>
@@ -3609,6 +3675,10 @@
           </m:e>
           <m:sup>
             <m:r>
+              <m:rPr>
+                <w:rFonts w:ascii="Cambria Math" w:hAnsi="Cambria Math" w:eastAsia="Cambria Math" w:cs="Cambria Math"/>
+                <m:sty m:val="p"/>
+              </m:rPr>
               <m:t>r</m:t>
             </m:r>
           </m:sup>
@@ -3664,6 +3734,10 @@
           </m:sub>
           <m:sup>
             <m:r>
+              <m:rPr>
+                <w:rFonts w:ascii="Cambria Math" w:hAnsi="Cambria Math" w:eastAsia="Cambria Math" w:cs="Cambria Math"/>
+                <m:sty m:val="p"/>
+              </m:rPr>
               <m:t>u</m:t>
             </m:r>
           </m:sup>
@@ -3710,6 +3784,10 @@
           </m:sub>
           <m:sup>
             <m:r>
+              <m:rPr>
+                <w:rFonts w:ascii="Cambria Math" w:hAnsi="Cambria Math" w:eastAsia="Cambria Math" w:cs="Cambria Math"/>
+                <m:sty m:val="p"/>
+              </m:rPr>
               <m:t>g</m:t>
             </m:r>
           </m:sup>
@@ -3894,6 +3972,10 @@
           </m:sub>
           <m:sup>
             <m:r>
+              <m:rPr>
+                <w:rFonts w:ascii="Cambria Math" w:hAnsi="Cambria Math" w:eastAsia="Cambria Math" w:cs="Cambria Math"/>
+                <m:sty m:val="p"/>
+              </m:rPr>
               <m:t>g</m:t>
             </m:r>
             <m:r>
@@ -4027,6 +4109,10 @@
                       </m:sub>
                       <m:sup>
                         <m:r>
+                          <m:rPr>
+                            <w:rFonts w:ascii="Cambria Math" w:hAnsi="Cambria Math" w:eastAsia="Cambria Math" w:cs="Cambria Math"/>
+                            <m:sty m:val="p"/>
+                          </m:rPr>
                           <m:t>u</m:t>
                         </m:r>
                       </m:sup>
@@ -4054,6 +4140,10 @@
                           </m:e>
                           <m:sub>
                             <m:r>
+                              <m:rPr>
+                                <w:rFonts w:ascii="Cambria Math" w:hAnsi="Cambria Math" w:eastAsia="Cambria Math" w:cs="Cambria Math"/>
+                                <m:sty m:val="p"/>
+                              </m:rPr>
                               <m:t>u</m:t>
                             </m:r>
                           </m:sub>
@@ -4092,6 +4182,10 @@
                           </m:sub>
                           <m:sup>
                             <m:r>
+                              <m:rPr>
+                                <w:rFonts w:ascii="Cambria Math" w:hAnsi="Cambria Math" w:eastAsia="Cambria Math" w:cs="Cambria Math"/>
+                                <m:sty m:val="p"/>
+                              </m:rPr>
                               <m:t>u</m:t>
                             </m:r>
                           </m:sup>
@@ -4128,6 +4222,10 @@
                           </m:sub>
                           <m:sup>
                             <m:r>
+                              <m:rPr>
+                                <w:rFonts w:ascii="Cambria Math" w:hAnsi="Cambria Math" w:eastAsia="Cambria Math" w:cs="Cambria Math"/>
+                                <m:sty m:val="p"/>
+                              </m:rPr>
                               <m:t>u</m:t>
                             </m:r>
                           </m:sup>
@@ -4183,6 +4281,10 @@
                       </m:sub>
                       <m:sup>
                         <m:r>
+                          <m:rPr>
+                            <w:rFonts w:ascii="Cambria Math" w:hAnsi="Cambria Math" w:eastAsia="Cambria Math" w:cs="Cambria Math"/>
+                            <m:sty m:val="p"/>
+                          </m:rPr>
                           <m:t>g</m:t>
                         </m:r>
                         <m:r>
@@ -4316,6 +4418,10 @@
                               </m:e>
                               <m:sup>
                                 <m:r>
+                                  <m:rPr>
+                                    <w:rFonts w:ascii="Cambria Math" w:hAnsi="Cambria Math" w:eastAsia="Cambria Math" w:cs="Cambria Math"/>
+                                    <m:sty m:val="p"/>
+                                  </m:rPr>
                                   <m:t>r</m:t>
                                 </m:r>
                               </m:sup>
@@ -4356,6 +4462,10 @@
                           </m:sub>
                           <m:sup>
                             <m:r>
+                              <m:rPr>
+                                <w:rFonts w:ascii="Cambria Math" w:hAnsi="Cambria Math" w:eastAsia="Cambria Math" w:cs="Cambria Math"/>
+                                <m:sty m:val="p"/>
+                              </m:rPr>
                               <m:t>g</m:t>
                             </m:r>
                             <m:r>
@@ -4420,6 +4530,10 @@
                           </m:sub>
                           <m:sup>
                             <m:r>
+                              <m:rPr>
+                                <w:rFonts w:ascii="Cambria Math" w:hAnsi="Cambria Math" w:eastAsia="Cambria Math" w:cs="Cambria Math"/>
+                                <m:sty m:val="p"/>
+                              </m:rPr>
                               <m:t>g</m:t>
                             </m:r>
                           </m:sup>
@@ -4572,6 +4686,10 @@
                           </m:sub>
                           <m:sup>
                             <m:r>
+                              <m:rPr>
+                                <w:rFonts w:ascii="Cambria Math" w:hAnsi="Cambria Math" w:eastAsia="Cambria Math" w:cs="Cambria Math"/>
+                                <m:sty m:val="p"/>
+                              </m:rPr>
                               <m:t>u</m:t>
                             </m:r>
                           </m:sup>
@@ -4623,6 +4741,10 @@
                           </m:sub>
                           <m:sup>
                             <m:r>
+                              <m:rPr>
+                                <w:rFonts w:ascii="Cambria Math" w:hAnsi="Cambria Math" w:eastAsia="Cambria Math" w:cs="Cambria Math"/>
+                                <m:sty m:val="p"/>
+                              </m:rPr>
                               <m:t>g</m:t>
                             </m:r>
                             <m:r>
@@ -4769,536 +4891,586 @@
             </w:pPr>
             <m:oMathPara>
               <m:oMath>
-                <m:sSubSup>
-                  <m:e>
-                    <m:acc>
-                      <m:accPr>
-                        <m:chr m:val="̂"/>
-                      </m:accPr>
-                      <m:e>
-                        <m:r>
-                          <m:t>T</m:t>
-                        </m:r>
-                      </m:e>
-                    </m:acc>
-                  </m:e>
-                  <m:sub>
-                    <m:r>
-                      <m:t>i</m:t>
-                    </m:r>
-                    <m:r>
-                      <m:rPr>
-                        <w:rFonts w:ascii="Cambria Math" w:hAnsi="Cambria Math" w:eastAsia="Cambria Math" w:cs="Cambria Math"/>
-                        <m:sty m:val="p"/>
-                      </m:rPr>
-                      <m:t>,</m:t>
-                    </m:r>
-                    <m:r>
-                      <m:t>v</m:t>
-                    </m:r>
-                    <m:r>
-                      <m:rPr>
-                        <w:rFonts w:ascii="Cambria Math" w:hAnsi="Cambria Math" w:eastAsia="Cambria Math" w:cs="Cambria Math"/>
-                        <m:sty m:val="p"/>
-                      </m:rPr>
-                      <m:t>,</m:t>
-                    </m:r>
-                    <m:r>
-                      <m:t>p</m:t>
-                    </m:r>
-                    <m:r>
-                      <m:rPr>
-                        <w:rFonts w:ascii="Cambria Math" w:hAnsi="Cambria Math" w:eastAsia="Cambria Math" w:cs="Cambria Math"/>
-                        <m:sty m:val="p"/>
-                      </m:rPr>
-                      <m:t>,</m:t>
-                    </m:r>
-                    <m:r>
-                      <m:t>t</m:t>
-                    </m:r>
-                  </m:sub>
-                  <m:sup>
-                    <m:r>
-                      <m:rPr>
-                        <w:rFonts w:ascii="Cambria Math" w:hAnsi="Cambria Math" w:eastAsia="Cambria Math" w:cs="Cambria Math"/>
-                        <m:sty m:val="p"/>
-                      </m:rPr>
-                      <m:t>w</m:t>
-                    </m:r>
-                    <m:r>
-                      <m:rPr>
-                        <w:rFonts w:ascii="Cambria Math" w:hAnsi="Cambria Math" w:eastAsia="Cambria Math" w:cs="Cambria Math"/>
-                        <m:sty m:val="p"/>
-                      </m:rPr>
-                      <m:t>a</m:t>
-                    </m:r>
-                    <m:r>
-                      <m:rPr>
-                        <w:rFonts w:ascii="Cambria Math" w:hAnsi="Cambria Math" w:eastAsia="Cambria Math" w:cs="Cambria Math"/>
-                        <m:sty m:val="p"/>
-                      </m:rPr>
-                      <m:t>i</m:t>
-                    </m:r>
-                    <m:r>
-                      <m:rPr>
-                        <w:rFonts w:ascii="Cambria Math" w:hAnsi="Cambria Math" w:eastAsia="Cambria Math" w:cs="Cambria Math"/>
-                        <m:sty m:val="p"/>
-                      </m:rPr>
-                      <m:t>t</m:t>
-                    </m:r>
-                    <m:r>
-                      <m:rPr>
-                        <w:rFonts w:ascii="Cambria Math" w:hAnsi="Cambria Math" w:eastAsia="Cambria Math" w:cs="Cambria Math"/>
-                        <m:sty m:val="p"/>
-                      </m:rPr>
-                      <m:t>,</m:t>
-                    </m:r>
-                    <m:r>
-                      <m:t>u</m:t>
-                    </m:r>
-                  </m:sup>
-                </m:sSubSup>
-                <m:r>
-                  <m:rPr>
-                    <w:rFonts w:ascii="Cambria Math" w:hAnsi="Cambria Math" w:eastAsia="Cambria Math" w:cs="Cambria Math"/>
-                    <m:sty m:val="p"/>
-                  </m:rPr>
-                  <m:t>=</m:t>
-                </m:r>
-                <m:r>
-                  <m:rPr>
-                    <w:rFonts w:ascii="Cambria Math" w:hAnsi="Cambria Math" w:eastAsia="Cambria Math" w:cs="Cambria Math"/>
-                    <m:sty m:val="p"/>
-                  </m:rPr>
-                  <m:t>max</m:t>
-                </m:r>
-                <m:d>
-                  <m:dPr>
-                    <m:begChr m:val="("/>
-                    <m:sepChr m:val=""/>
-                    <m:endChr m:val=")"/>
-                    <m:grow/>
-                  </m:dPr>
-                  <m:e>
-                    <m:r>
-                      <m:t>0</m:t>
-                    </m:r>
-                    <m:r>
-                      <m:rPr>
-                        <w:rFonts w:ascii="Cambria Math" w:hAnsi="Cambria Math" w:eastAsia="Cambria Math" w:cs="Cambria Math"/>
-                        <m:sty m:val="p"/>
-                      </m:rPr>
-                      <m:t>,</m:t>
-                    </m:r>
-                    <m:sSubSup>
-                      <m:e>
-                        <m:acc>
-                          <m:accPr>
-                            <m:chr m:val="̂"/>
-                          </m:accPr>
-                          <m:e>
-                            <m:r>
-                              <m:t>T</m:t>
-                            </m:r>
-                          </m:e>
-                        </m:acc>
-                      </m:e>
-                      <m:sub>
-                        <m:r>
-                          <m:t>v</m:t>
-                        </m:r>
-                        <m:r>
-                          <m:rPr>
-                            <w:rFonts w:ascii="Cambria Math" w:hAnsi="Cambria Math" w:eastAsia="Cambria Math" w:cs="Cambria Math"/>
-                            <m:sty m:val="p"/>
-                          </m:rPr>
-                          <m:t>,</m:t>
-                        </m:r>
-                        <m:r>
-                          <m:t>p</m:t>
-                        </m:r>
-                        <m:r>
-                          <m:rPr>
-                            <w:rFonts w:ascii="Cambria Math" w:hAnsi="Cambria Math" w:eastAsia="Cambria Math" w:cs="Cambria Math"/>
-                            <m:sty m:val="p"/>
-                          </m:rPr>
-                          <m:t>,</m:t>
-                        </m:r>
-                        <m:r>
-                          <m:t>t</m:t>
-                        </m:r>
-                      </m:sub>
-                      <m:sup>
-                        <m:r>
-                          <m:t>g</m:t>
-                        </m:r>
-                        <m:r>
-                          <m:rPr>
-                            <w:rFonts w:ascii="Cambria Math" w:hAnsi="Cambria Math" w:eastAsia="Cambria Math" w:cs="Cambria Math"/>
-                            <m:sty m:val="p"/>
-                          </m:rPr>
-                          <m:t>,</m:t>
-                        </m:r>
-                        <m:r>
-                          <m:rPr>
-                            <w:rFonts w:ascii="Cambria Math" w:hAnsi="Cambria Math" w:eastAsia="Cambria Math" w:cs="Cambria Math"/>
-                            <m:sty m:val="p"/>
-                          </m:rPr>
-                          <m:t>r</m:t>
-                        </m:r>
-                        <m:r>
-                          <m:rPr>
-                            <w:rFonts w:ascii="Cambria Math" w:hAnsi="Cambria Math" w:eastAsia="Cambria Math" w:cs="Cambria Math"/>
-                            <m:sty m:val="p"/>
-                          </m:rPr>
-                          <m:t>e</m:t>
-                        </m:r>
-                        <m:r>
-                          <m:rPr>
-                            <w:rFonts w:ascii="Cambria Math" w:hAnsi="Cambria Math" w:eastAsia="Cambria Math" w:cs="Cambria Math"/>
-                            <m:sty m:val="p"/>
-                          </m:rPr>
-                          <m:t>a</m:t>
-                        </m:r>
-                        <m:r>
-                          <m:rPr>
-                            <w:rFonts w:ascii="Cambria Math" w:hAnsi="Cambria Math" w:eastAsia="Cambria Math" w:cs="Cambria Math"/>
-                            <m:sty m:val="p"/>
-                          </m:rPr>
-                          <m:t>d</m:t>
-                        </m:r>
-                        <m:r>
-                          <m:rPr>
-                            <w:rFonts w:ascii="Cambria Math" w:hAnsi="Cambria Math" w:eastAsia="Cambria Math" w:cs="Cambria Math"/>
-                            <m:sty m:val="p"/>
-                          </m:rPr>
-                          <m:t>y</m:t>
-                        </m:r>
-                      </m:sup>
-                    </m:sSubSup>
-                    <m:r>
-                      <m:rPr>
-                        <w:rFonts w:ascii="Cambria Math" w:hAnsi="Cambria Math" w:eastAsia="Cambria Math" w:cs="Cambria Math"/>
-                        <m:sty m:val="p"/>
-                      </m:rPr>
-                      <m:t>−</m:t>
-                    </m:r>
-                    <m:sSubSup>
-                      <m:e>
-                        <m:acc>
-                          <m:accPr>
-                            <m:chr m:val="̂"/>
-                          </m:accPr>
-                          <m:e>
-                            <m:r>
-                              <m:t>T</m:t>
-                            </m:r>
-                          </m:e>
-                        </m:acc>
-                      </m:e>
-                      <m:sub>
-                        <m:r>
-                          <m:t>i</m:t>
-                        </m:r>
-                        <m:r>
-                          <m:rPr>
-                            <w:rFonts w:ascii="Cambria Math" w:hAnsi="Cambria Math" w:eastAsia="Cambria Math" w:cs="Cambria Math"/>
-                            <m:sty m:val="p"/>
-                          </m:rPr>
-                          <m:t>,</m:t>
-                        </m:r>
-                        <m:r>
-                          <m:t>p</m:t>
-                        </m:r>
-                        <m:r>
-                          <m:rPr>
-                            <w:rFonts w:ascii="Cambria Math" w:hAnsi="Cambria Math" w:eastAsia="Cambria Math" w:cs="Cambria Math"/>
-                            <m:sty m:val="p"/>
-                          </m:rPr>
-                          <m:t>,</m:t>
-                        </m:r>
-                        <m:r>
-                          <m:t>t</m:t>
-                        </m:r>
-                      </m:sub>
-                      <m:sup>
-                        <m:r>
-                          <m:t>u</m:t>
-                        </m:r>
-                      </m:sup>
-                    </m:sSubSup>
-                  </m:e>
-                </m:d>
-                <m:r>
-                  <m:rPr>
-                    <w:rFonts w:ascii="Cambria Math" w:hAnsi="Cambria Math" w:eastAsia="Cambria Math" w:cs="Cambria Math"/>
-                    <m:sty m:val="p"/>
-                  </m:rPr>
-                  <m:t>,</m:t>
-                </m:r>
-                <m:r>
-                  <m:t>  </m:t>
-                </m:r>
-                <m:sSubSup>
-                  <m:e>
-                    <m:acc>
-                      <m:accPr>
-                        <m:chr m:val="̂"/>
-                      </m:accPr>
-                      <m:e>
-                        <m:r>
-                          <m:t>T</m:t>
-                        </m:r>
-                      </m:e>
-                    </m:acc>
-                  </m:e>
-                  <m:sub>
-                    <m:r>
-                      <m:t>i</m:t>
-                    </m:r>
-                    <m:r>
-                      <m:rPr>
-                        <w:rFonts w:ascii="Cambria Math" w:hAnsi="Cambria Math" w:eastAsia="Cambria Math" w:cs="Cambria Math"/>
-                        <m:sty m:val="p"/>
-                      </m:rPr>
-                      <m:t>,</m:t>
-                    </m:r>
-                    <m:r>
-                      <m:t>v</m:t>
-                    </m:r>
-                    <m:r>
-                      <m:rPr>
-                        <w:rFonts w:ascii="Cambria Math" w:hAnsi="Cambria Math" w:eastAsia="Cambria Math" w:cs="Cambria Math"/>
-                        <m:sty m:val="p"/>
-                      </m:rPr>
-                      <m:t>,</m:t>
-                    </m:r>
-                    <m:r>
-                      <m:t>p</m:t>
-                    </m:r>
-                    <m:r>
-                      <m:rPr>
-                        <w:rFonts w:ascii="Cambria Math" w:hAnsi="Cambria Math" w:eastAsia="Cambria Math" w:cs="Cambria Math"/>
-                        <m:sty m:val="p"/>
-                      </m:rPr>
-                      <m:t>,</m:t>
-                    </m:r>
-                    <m:r>
-                      <m:t>t</m:t>
-                    </m:r>
-                  </m:sub>
-                  <m:sup>
-                    <m:r>
-                      <m:rPr>
-                        <w:rFonts w:ascii="Cambria Math" w:hAnsi="Cambria Math" w:eastAsia="Cambria Math" w:cs="Cambria Math"/>
-                        <m:sty m:val="p"/>
-                      </m:rPr>
-                      <m:t>w</m:t>
-                    </m:r>
-                    <m:r>
-                      <m:rPr>
-                        <w:rFonts w:ascii="Cambria Math" w:hAnsi="Cambria Math" w:eastAsia="Cambria Math" w:cs="Cambria Math"/>
-                        <m:sty m:val="p"/>
-                      </m:rPr>
-                      <m:t>a</m:t>
-                    </m:r>
-                    <m:r>
-                      <m:rPr>
-                        <w:rFonts w:ascii="Cambria Math" w:hAnsi="Cambria Math" w:eastAsia="Cambria Math" w:cs="Cambria Math"/>
-                        <m:sty m:val="p"/>
-                      </m:rPr>
-                      <m:t>i</m:t>
-                    </m:r>
-                    <m:r>
-                      <m:rPr>
-                        <w:rFonts w:ascii="Cambria Math" w:hAnsi="Cambria Math" w:eastAsia="Cambria Math" w:cs="Cambria Math"/>
-                        <m:sty m:val="p"/>
-                      </m:rPr>
-                      <m:t>t</m:t>
-                    </m:r>
-                    <m:r>
-                      <m:rPr>
-                        <w:rFonts w:ascii="Cambria Math" w:hAnsi="Cambria Math" w:eastAsia="Cambria Math" w:cs="Cambria Math"/>
-                        <m:sty m:val="p"/>
-                      </m:rPr>
-                      <m:t>,</m:t>
-                    </m:r>
-                    <m:r>
-                      <m:t>g</m:t>
-                    </m:r>
-                  </m:sup>
-                </m:sSubSup>
-                <m:r>
-                  <m:rPr>
-                    <w:rFonts w:ascii="Cambria Math" w:hAnsi="Cambria Math" w:eastAsia="Cambria Math" w:cs="Cambria Math"/>
-                    <m:sty m:val="p"/>
-                  </m:rPr>
-                  <m:t>=</m:t>
-                </m:r>
-                <m:r>
-                  <m:rPr>
-                    <w:rFonts w:ascii="Cambria Math" w:hAnsi="Cambria Math" w:eastAsia="Cambria Math" w:cs="Cambria Math"/>
-                    <m:sty m:val="p"/>
-                  </m:rPr>
-                  <m:t>max</m:t>
-                </m:r>
-                <m:d>
-                  <m:dPr>
-                    <m:begChr m:val="("/>
-                    <m:sepChr m:val=""/>
-                    <m:endChr m:val=")"/>
-                    <m:grow/>
-                  </m:dPr>
-                  <m:e>
-                    <m:r>
-                      <m:t>0</m:t>
-                    </m:r>
-                    <m:r>
-                      <m:rPr>
-                        <w:rFonts w:ascii="Cambria Math" w:hAnsi="Cambria Math" w:eastAsia="Cambria Math" w:cs="Cambria Math"/>
-                        <m:sty m:val="p"/>
-                      </m:rPr>
-                      <m:t>,</m:t>
-                    </m:r>
-                    <m:sSubSup>
-                      <m:e>
-                        <m:acc>
-                          <m:accPr>
-                            <m:chr m:val="̂"/>
-                          </m:accPr>
-                          <m:e>
-                            <m:r>
-                              <m:t>T</m:t>
-                            </m:r>
-                          </m:e>
-                        </m:acc>
-                      </m:e>
-                      <m:sub>
-                        <m:r>
-                          <m:t>i</m:t>
-                        </m:r>
-                        <m:r>
-                          <m:rPr>
-                            <w:rFonts w:ascii="Cambria Math" w:hAnsi="Cambria Math" w:eastAsia="Cambria Math" w:cs="Cambria Math"/>
-                            <m:sty m:val="p"/>
-                          </m:rPr>
-                          <m:t>,</m:t>
-                        </m:r>
-                        <m:r>
-                          <m:t>p</m:t>
-                        </m:r>
-                        <m:r>
-                          <m:rPr>
-                            <w:rFonts w:ascii="Cambria Math" w:hAnsi="Cambria Math" w:eastAsia="Cambria Math" w:cs="Cambria Math"/>
-                            <m:sty m:val="p"/>
-                          </m:rPr>
-                          <m:t>,</m:t>
-                        </m:r>
-                        <m:r>
-                          <m:t>t</m:t>
-                        </m:r>
-                      </m:sub>
-                      <m:sup>
-                        <m:r>
-                          <m:t>u</m:t>
-                        </m:r>
-                      </m:sup>
-                    </m:sSubSup>
-                    <m:r>
-                      <m:rPr>
-                        <w:rFonts w:ascii="Cambria Math" w:hAnsi="Cambria Math" w:eastAsia="Cambria Math" w:cs="Cambria Math"/>
-                        <m:sty m:val="p"/>
-                      </m:rPr>
-                      <m:t>−</m:t>
-                    </m:r>
-                    <m:sSubSup>
-                      <m:e>
-                        <m:acc>
-                          <m:accPr>
-                            <m:chr m:val="̂"/>
-                          </m:accPr>
-                          <m:e>
-                            <m:r>
-                              <m:t>T</m:t>
-                            </m:r>
-                          </m:e>
-                        </m:acc>
-                      </m:e>
-                      <m:sub>
-                        <m:r>
-                          <m:t>v</m:t>
-                        </m:r>
-                        <m:r>
-                          <m:rPr>
-                            <w:rFonts w:ascii="Cambria Math" w:hAnsi="Cambria Math" w:eastAsia="Cambria Math" w:cs="Cambria Math"/>
-                            <m:sty m:val="p"/>
-                          </m:rPr>
-                          <m:t>,</m:t>
-                        </m:r>
-                        <m:r>
-                          <m:t>p</m:t>
-                        </m:r>
-                        <m:r>
-                          <m:rPr>
-                            <w:rFonts w:ascii="Cambria Math" w:hAnsi="Cambria Math" w:eastAsia="Cambria Math" w:cs="Cambria Math"/>
-                            <m:sty m:val="p"/>
-                          </m:rPr>
-                          <m:t>,</m:t>
-                        </m:r>
-                        <m:r>
-                          <m:t>t</m:t>
-                        </m:r>
-                      </m:sub>
-                      <m:sup>
-                        <m:r>
-                          <m:t>g</m:t>
-                        </m:r>
-                        <m:r>
-                          <m:rPr>
-                            <w:rFonts w:ascii="Cambria Math" w:hAnsi="Cambria Math" w:eastAsia="Cambria Math" w:cs="Cambria Math"/>
-                            <m:sty m:val="p"/>
-                          </m:rPr>
-                          <m:t>,</m:t>
-                        </m:r>
-                        <m:r>
-                          <m:rPr>
-                            <w:rFonts w:ascii="Cambria Math" w:hAnsi="Cambria Math" w:eastAsia="Cambria Math" w:cs="Cambria Math"/>
-                            <m:sty m:val="p"/>
-                          </m:rPr>
-                          <m:t>r</m:t>
-                        </m:r>
-                        <m:r>
-                          <m:rPr>
-                            <w:rFonts w:ascii="Cambria Math" w:hAnsi="Cambria Math" w:eastAsia="Cambria Math" w:cs="Cambria Math"/>
-                            <m:sty m:val="p"/>
-                          </m:rPr>
-                          <m:t>e</m:t>
-                        </m:r>
-                        <m:r>
-                          <m:rPr>
-                            <w:rFonts w:ascii="Cambria Math" w:hAnsi="Cambria Math" w:eastAsia="Cambria Math" w:cs="Cambria Math"/>
-                            <m:sty m:val="p"/>
-                          </m:rPr>
-                          <m:t>a</m:t>
-                        </m:r>
-                        <m:r>
-                          <m:rPr>
-                            <w:rFonts w:ascii="Cambria Math" w:hAnsi="Cambria Math" w:eastAsia="Cambria Math" w:cs="Cambria Math"/>
-                            <m:sty m:val="p"/>
-                          </m:rPr>
-                          <m:t>d</m:t>
-                        </m:r>
-                        <m:r>
-                          <m:rPr>
-                            <w:rFonts w:ascii="Cambria Math" w:hAnsi="Cambria Math" w:eastAsia="Cambria Math" w:cs="Cambria Math"/>
-                            <m:sty m:val="p"/>
-                          </m:rPr>
-                          <m:t>y</m:t>
-                        </m:r>
-                      </m:sup>
-                    </m:sSubSup>
-                  </m:e>
-                </m:d>
+                <m:m>
+                  <m:mPr>
+                    <m:baseJc m:val="center"/>
+                    <m:plcHide m:val="on"/>
+                    <m:mcs>
+                      <m:mc>
+                        <m:mcPr>
+                          <m:mcJc m:val="right"/>
+                          <m:count m:val="1"/>
+                        </m:mcPr>
+                      </m:mc>
+                    </m:mcs>
+                  </m:mPr>
+                  <m:mr>
+                    <m:e>
+                      <m:sSubSup>
+                        <m:e>
+                          <m:acc>
+                            <m:accPr>
+                              <m:chr m:val="̂"/>
+                            </m:accPr>
+                            <m:e>
+                              <m:r>
+                                <m:t>T</m:t>
+                              </m:r>
+                            </m:e>
+                          </m:acc>
+                        </m:e>
+                        <m:sub>
+                          <m:r>
+                            <m:t>i</m:t>
+                          </m:r>
+                          <m:r>
+                            <m:rPr>
+                              <w:rFonts w:ascii="Cambria Math" w:hAnsi="Cambria Math" w:eastAsia="Cambria Math" w:cs="Cambria Math"/>
+                              <m:sty m:val="p"/>
+                            </m:rPr>
+                            <m:t>,</m:t>
+                          </m:r>
+                          <m:r>
+                            <m:t>v</m:t>
+                          </m:r>
+                          <m:r>
+                            <m:rPr>
+                              <w:rFonts w:ascii="Cambria Math" w:hAnsi="Cambria Math" w:eastAsia="Cambria Math" w:cs="Cambria Math"/>
+                              <m:sty m:val="p"/>
+                            </m:rPr>
+                            <m:t>,</m:t>
+                          </m:r>
+                          <m:r>
+                            <m:t>p</m:t>
+                          </m:r>
+                          <m:r>
+                            <m:rPr>
+                              <w:rFonts w:ascii="Cambria Math" w:hAnsi="Cambria Math" w:eastAsia="Cambria Math" w:cs="Cambria Math"/>
+                              <m:sty m:val="p"/>
+                            </m:rPr>
+                            <m:t>,</m:t>
+                          </m:r>
+                          <m:r>
+                            <m:t>t</m:t>
+                          </m:r>
+                        </m:sub>
+                        <m:sup>
+                          <m:r>
+                            <m:rPr>
+                              <w:rFonts w:ascii="Cambria Math" w:hAnsi="Cambria Math" w:eastAsia="Cambria Math" w:cs="Cambria Math"/>
+                              <m:sty m:val="p"/>
+                            </m:rPr>
+                            <m:t>w</m:t>
+                          </m:r>
+                          <m:r>
+                            <m:rPr>
+                              <w:rFonts w:ascii="Cambria Math" w:hAnsi="Cambria Math" w:eastAsia="Cambria Math" w:cs="Cambria Math"/>
+                              <m:sty m:val="p"/>
+                            </m:rPr>
+                            <m:t>a</m:t>
+                          </m:r>
+                          <m:r>
+                            <m:rPr>
+                              <w:rFonts w:ascii="Cambria Math" w:hAnsi="Cambria Math" w:eastAsia="Cambria Math" w:cs="Cambria Math"/>
+                              <m:sty m:val="p"/>
+                            </m:rPr>
+                            <m:t>i</m:t>
+                          </m:r>
+                          <m:r>
+                            <m:rPr>
+                              <w:rFonts w:ascii="Cambria Math" w:hAnsi="Cambria Math" w:eastAsia="Cambria Math" w:cs="Cambria Math"/>
+                              <m:sty m:val="p"/>
+                            </m:rPr>
+                            <m:t>t</m:t>
+                          </m:r>
+                          <m:r>
+                            <m:rPr>
+                              <w:rFonts w:ascii="Cambria Math" w:hAnsi="Cambria Math" w:eastAsia="Cambria Math" w:cs="Cambria Math"/>
+                              <m:sty m:val="p"/>
+                            </m:rPr>
+                            <m:t>,</m:t>
+                          </m:r>
+                          <m:r>
+                            <m:rPr>
+                              <w:rFonts w:ascii="Cambria Math" w:hAnsi="Cambria Math" w:eastAsia="Cambria Math" w:cs="Cambria Math"/>
+                              <m:sty m:val="p"/>
+                            </m:rPr>
+                            <m:t>u</m:t>
+                          </m:r>
+                        </m:sup>
+                      </m:sSubSup>
+                      <m:r>
+                        <m:rPr>
+                          <w:rFonts w:ascii="Cambria Math" w:hAnsi="Cambria Math" w:eastAsia="Cambria Math" w:cs="Cambria Math"/>
+                          <m:sty m:val="p"/>
+                        </m:rPr>
+                        <m:t>=</m:t>
+                      </m:r>
+                      <m:r>
+                        <m:rPr>
+                          <w:rFonts w:ascii="Cambria Math" w:hAnsi="Cambria Math" w:eastAsia="Cambria Math" w:cs="Cambria Math"/>
+                          <m:sty m:val="p"/>
+                        </m:rPr>
+                        <m:t>max</m:t>
+                      </m:r>
+                      <m:d>
+                        <m:dPr>
+                          <m:begChr m:val="("/>
+                          <m:sepChr m:val=""/>
+                          <m:endChr m:val=")"/>
+                          <m:grow/>
+                        </m:dPr>
+                        <m:e>
+                          <m:r>
+                            <m:t>0</m:t>
+                          </m:r>
+                          <m:r>
+                            <m:rPr>
+                              <w:rFonts w:ascii="Cambria Math" w:hAnsi="Cambria Math" w:eastAsia="Cambria Math" w:cs="Cambria Math"/>
+                              <m:sty m:val="p"/>
+                            </m:rPr>
+                            <m:t>,</m:t>
+                          </m:r>
+                          <m:sSubSup>
+                            <m:e>
+                              <m:acc>
+                                <m:accPr>
+                                  <m:chr m:val="̂"/>
+                                </m:accPr>
+                                <m:e>
+                                  <m:r>
+                                    <m:t>T</m:t>
+                                  </m:r>
+                                </m:e>
+                              </m:acc>
+                            </m:e>
+                            <m:sub>
+                              <m:r>
+                                <m:t>v</m:t>
+                              </m:r>
+                              <m:r>
+                                <m:rPr>
+                                  <w:rFonts w:ascii="Cambria Math" w:hAnsi="Cambria Math" w:eastAsia="Cambria Math" w:cs="Cambria Math"/>
+                                  <m:sty m:val="p"/>
+                                </m:rPr>
+                                <m:t>,</m:t>
+                              </m:r>
+                              <m:r>
+                                <m:t>p</m:t>
+                              </m:r>
+                              <m:r>
+                                <m:rPr>
+                                  <w:rFonts w:ascii="Cambria Math" w:hAnsi="Cambria Math" w:eastAsia="Cambria Math" w:cs="Cambria Math"/>
+                                  <m:sty m:val="p"/>
+                                </m:rPr>
+                                <m:t>,</m:t>
+                              </m:r>
+                              <m:r>
+                                <m:t>t</m:t>
+                              </m:r>
+                            </m:sub>
+                            <m:sup>
+                              <m:r>
+                                <m:rPr>
+                                  <w:rFonts w:ascii="Cambria Math" w:hAnsi="Cambria Math" w:eastAsia="Cambria Math" w:cs="Cambria Math"/>
+                                  <m:sty m:val="p"/>
+                                </m:rPr>
+                                <m:t>g</m:t>
+                              </m:r>
+                              <m:r>
+                                <m:rPr>
+                                  <w:rFonts w:ascii="Cambria Math" w:hAnsi="Cambria Math" w:eastAsia="Cambria Math" w:cs="Cambria Math"/>
+                                  <m:sty m:val="p"/>
+                                </m:rPr>
+                                <m:t>,</m:t>
+                              </m:r>
+                              <m:r>
+                                <m:rPr>
+                                  <w:rFonts w:ascii="Cambria Math" w:hAnsi="Cambria Math" w:eastAsia="Cambria Math" w:cs="Cambria Math"/>
+                                  <m:sty m:val="p"/>
+                                </m:rPr>
+                                <m:t>r</m:t>
+                              </m:r>
+                              <m:r>
+                                <m:rPr>
+                                  <w:rFonts w:ascii="Cambria Math" w:hAnsi="Cambria Math" w:eastAsia="Cambria Math" w:cs="Cambria Math"/>
+                                  <m:sty m:val="p"/>
+                                </m:rPr>
+                                <m:t>e</m:t>
+                              </m:r>
+                              <m:r>
+                                <m:rPr>
+                                  <w:rFonts w:ascii="Cambria Math" w:hAnsi="Cambria Math" w:eastAsia="Cambria Math" w:cs="Cambria Math"/>
+                                  <m:sty m:val="p"/>
+                                </m:rPr>
+                                <m:t>a</m:t>
+                              </m:r>
+                              <m:r>
+                                <m:rPr>
+                                  <w:rFonts w:ascii="Cambria Math" w:hAnsi="Cambria Math" w:eastAsia="Cambria Math" w:cs="Cambria Math"/>
+                                  <m:sty m:val="p"/>
+                                </m:rPr>
+                                <m:t>d</m:t>
+                              </m:r>
+                              <m:r>
+                                <m:rPr>
+                                  <w:rFonts w:ascii="Cambria Math" w:hAnsi="Cambria Math" w:eastAsia="Cambria Math" w:cs="Cambria Math"/>
+                                  <m:sty m:val="p"/>
+                                </m:rPr>
+                                <m:t>y</m:t>
+                              </m:r>
+                            </m:sup>
+                          </m:sSubSup>
+                          <m:r>
+                            <m:rPr>
+                              <w:rFonts w:ascii="Cambria Math" w:hAnsi="Cambria Math" w:eastAsia="Cambria Math" w:cs="Cambria Math"/>
+                              <m:sty m:val="p"/>
+                            </m:rPr>
+                            <m:t>−</m:t>
+                          </m:r>
+                          <m:sSubSup>
+                            <m:e>
+                              <m:acc>
+                                <m:accPr>
+                                  <m:chr m:val="̂"/>
+                                </m:accPr>
+                                <m:e>
+                                  <m:r>
+                                    <m:t>T</m:t>
+                                  </m:r>
+                                </m:e>
+                              </m:acc>
+                            </m:e>
+                            <m:sub>
+                              <m:r>
+                                <m:t>i</m:t>
+                              </m:r>
+                              <m:r>
+                                <m:rPr>
+                                  <w:rFonts w:ascii="Cambria Math" w:hAnsi="Cambria Math" w:eastAsia="Cambria Math" w:cs="Cambria Math"/>
+                                  <m:sty m:val="p"/>
+                                </m:rPr>
+                                <m:t>,</m:t>
+                              </m:r>
+                              <m:r>
+                                <m:t>p</m:t>
+                              </m:r>
+                              <m:r>
+                                <m:rPr>
+                                  <w:rFonts w:ascii="Cambria Math" w:hAnsi="Cambria Math" w:eastAsia="Cambria Math" w:cs="Cambria Math"/>
+                                  <m:sty m:val="p"/>
+                                </m:rPr>
+                                <m:t>,</m:t>
+                              </m:r>
+                              <m:r>
+                                <m:t>t</m:t>
+                              </m:r>
+                            </m:sub>
+                            <m:sup>
+                              <m:r>
+                                <m:rPr>
+                                  <w:rFonts w:ascii="Cambria Math" w:hAnsi="Cambria Math" w:eastAsia="Cambria Math" w:cs="Cambria Math"/>
+                                  <m:sty m:val="p"/>
+                                </m:rPr>
+                                <m:t>u</m:t>
+                              </m:r>
+                            </m:sup>
+                          </m:sSubSup>
+                        </m:e>
+                      </m:d>
+                      <m:r>
+                        <m:rPr>
+                          <w:rFonts w:ascii="Cambria Math" w:hAnsi="Cambria Math" w:eastAsia="Cambria Math" w:cs="Cambria Math"/>
+                          <m:sty m:val="p"/>
+                        </m:rPr>
+                        <m:t>,</m:t>
+                      </m:r>
+                    </m:e>
+                  </m:mr>
+                  <m:mr>
+                    <m:e>
+                      <m:sSubSup>
+                        <m:e>
+                          <m:acc>
+                            <m:accPr>
+                              <m:chr m:val="̂"/>
+                            </m:accPr>
+                            <m:e>
+                              <m:r>
+                                <m:t>T</m:t>
+                              </m:r>
+                            </m:e>
+                          </m:acc>
+                        </m:e>
+                        <m:sub>
+                          <m:r>
+                            <m:t>i</m:t>
+                          </m:r>
+                          <m:r>
+                            <m:rPr>
+                              <w:rFonts w:ascii="Cambria Math" w:hAnsi="Cambria Math" w:eastAsia="Cambria Math" w:cs="Cambria Math"/>
+                              <m:sty m:val="p"/>
+                            </m:rPr>
+                            <m:t>,</m:t>
+                          </m:r>
+                          <m:r>
+                            <m:t>v</m:t>
+                          </m:r>
+                          <m:r>
+                            <m:rPr>
+                              <w:rFonts w:ascii="Cambria Math" w:hAnsi="Cambria Math" w:eastAsia="Cambria Math" w:cs="Cambria Math"/>
+                              <m:sty m:val="p"/>
+                            </m:rPr>
+                            <m:t>,</m:t>
+                          </m:r>
+                          <m:r>
+                            <m:t>p</m:t>
+                          </m:r>
+                          <m:r>
+                            <m:rPr>
+                              <w:rFonts w:ascii="Cambria Math" w:hAnsi="Cambria Math" w:eastAsia="Cambria Math" w:cs="Cambria Math"/>
+                              <m:sty m:val="p"/>
+                            </m:rPr>
+                            <m:t>,</m:t>
+                          </m:r>
+                          <m:r>
+                            <m:t>t</m:t>
+                          </m:r>
+                        </m:sub>
+                        <m:sup>
+                          <m:r>
+                            <m:rPr>
+                              <w:rFonts w:ascii="Cambria Math" w:hAnsi="Cambria Math" w:eastAsia="Cambria Math" w:cs="Cambria Math"/>
+                              <m:sty m:val="p"/>
+                            </m:rPr>
+                            <m:t>w</m:t>
+                          </m:r>
+                          <m:r>
+                            <m:rPr>
+                              <w:rFonts w:ascii="Cambria Math" w:hAnsi="Cambria Math" w:eastAsia="Cambria Math" w:cs="Cambria Math"/>
+                              <m:sty m:val="p"/>
+                            </m:rPr>
+                            <m:t>a</m:t>
+                          </m:r>
+                          <m:r>
+                            <m:rPr>
+                              <w:rFonts w:ascii="Cambria Math" w:hAnsi="Cambria Math" w:eastAsia="Cambria Math" w:cs="Cambria Math"/>
+                              <m:sty m:val="p"/>
+                            </m:rPr>
+                            <m:t>i</m:t>
+                          </m:r>
+                          <m:r>
+                            <m:rPr>
+                              <w:rFonts w:ascii="Cambria Math" w:hAnsi="Cambria Math" w:eastAsia="Cambria Math" w:cs="Cambria Math"/>
+                              <m:sty m:val="p"/>
+                            </m:rPr>
+                            <m:t>t</m:t>
+                          </m:r>
+                          <m:r>
+                            <m:rPr>
+                              <w:rFonts w:ascii="Cambria Math" w:hAnsi="Cambria Math" w:eastAsia="Cambria Math" w:cs="Cambria Math"/>
+                              <m:sty m:val="p"/>
+                            </m:rPr>
+                            <m:t>,</m:t>
+                          </m:r>
+                          <m:r>
+                            <m:rPr>
+                              <w:rFonts w:ascii="Cambria Math" w:hAnsi="Cambria Math" w:eastAsia="Cambria Math" w:cs="Cambria Math"/>
+                              <m:sty m:val="p"/>
+                            </m:rPr>
+                            <m:t>g</m:t>
+                          </m:r>
+                        </m:sup>
+                      </m:sSubSup>
+                      <m:r>
+                        <m:rPr>
+                          <w:rFonts w:ascii="Cambria Math" w:hAnsi="Cambria Math" w:eastAsia="Cambria Math" w:cs="Cambria Math"/>
+                          <m:sty m:val="p"/>
+                        </m:rPr>
+                        <m:t>=</m:t>
+                      </m:r>
+                      <m:r>
+                        <m:rPr>
+                          <w:rFonts w:ascii="Cambria Math" w:hAnsi="Cambria Math" w:eastAsia="Cambria Math" w:cs="Cambria Math"/>
+                          <m:sty m:val="p"/>
+                        </m:rPr>
+                        <m:t>max</m:t>
+                      </m:r>
+                      <m:d>
+                        <m:dPr>
+                          <m:begChr m:val="("/>
+                          <m:sepChr m:val=""/>
+                          <m:endChr m:val=")"/>
+                          <m:grow/>
+                        </m:dPr>
+                        <m:e>
+                          <m:r>
+                            <m:t>0</m:t>
+                          </m:r>
+                          <m:r>
+                            <m:rPr>
+                              <w:rFonts w:ascii="Cambria Math" w:hAnsi="Cambria Math" w:eastAsia="Cambria Math" w:cs="Cambria Math"/>
+                              <m:sty m:val="p"/>
+                            </m:rPr>
+                            <m:t>,</m:t>
+                          </m:r>
+                          <m:sSubSup>
+                            <m:e>
+                              <m:acc>
+                                <m:accPr>
+                                  <m:chr m:val="̂"/>
+                                </m:accPr>
+                                <m:e>
+                                  <m:r>
+                                    <m:t>T</m:t>
+                                  </m:r>
+                                </m:e>
+                              </m:acc>
+                            </m:e>
+                            <m:sub>
+                              <m:r>
+                                <m:t>i</m:t>
+                              </m:r>
+                              <m:r>
+                                <m:rPr>
+                                  <w:rFonts w:ascii="Cambria Math" w:hAnsi="Cambria Math" w:eastAsia="Cambria Math" w:cs="Cambria Math"/>
+                                  <m:sty m:val="p"/>
+                                </m:rPr>
+                                <m:t>,</m:t>
+                              </m:r>
+                              <m:r>
+                                <m:t>p</m:t>
+                              </m:r>
+                              <m:r>
+                                <m:rPr>
+                                  <w:rFonts w:ascii="Cambria Math" w:hAnsi="Cambria Math" w:eastAsia="Cambria Math" w:cs="Cambria Math"/>
+                                  <m:sty m:val="p"/>
+                                </m:rPr>
+                                <m:t>,</m:t>
+                              </m:r>
+                              <m:r>
+                                <m:t>t</m:t>
+                              </m:r>
+                            </m:sub>
+                            <m:sup>
+                              <m:r>
+                                <m:rPr>
+                                  <w:rFonts w:ascii="Cambria Math" w:hAnsi="Cambria Math" w:eastAsia="Cambria Math" w:cs="Cambria Math"/>
+                                  <m:sty m:val="p"/>
+                                </m:rPr>
+                                <m:t>u</m:t>
+                              </m:r>
+                            </m:sup>
+                          </m:sSubSup>
+                          <m:r>
+                            <m:rPr>
+                              <w:rFonts w:ascii="Cambria Math" w:hAnsi="Cambria Math" w:eastAsia="Cambria Math" w:cs="Cambria Math"/>
+                              <m:sty m:val="p"/>
+                            </m:rPr>
+                            <m:t>−</m:t>
+                          </m:r>
+                          <m:sSubSup>
+                            <m:e>
+                              <m:acc>
+                                <m:accPr>
+                                  <m:chr m:val="̂"/>
+                                </m:accPr>
+                                <m:e>
+                                  <m:r>
+                                    <m:t>T</m:t>
+                                  </m:r>
+                                </m:e>
+                              </m:acc>
+                            </m:e>
+                            <m:sub>
+                              <m:r>
+                                <m:t>v</m:t>
+                              </m:r>
+                              <m:r>
+                                <m:rPr>
+                                  <w:rFonts w:ascii="Cambria Math" w:hAnsi="Cambria Math" w:eastAsia="Cambria Math" w:cs="Cambria Math"/>
+                                  <m:sty m:val="p"/>
+                                </m:rPr>
+                                <m:t>,</m:t>
+                              </m:r>
+                              <m:r>
+                                <m:t>p</m:t>
+                              </m:r>
+                              <m:r>
+                                <m:rPr>
+                                  <w:rFonts w:ascii="Cambria Math" w:hAnsi="Cambria Math" w:eastAsia="Cambria Math" w:cs="Cambria Math"/>
+                                  <m:sty m:val="p"/>
+                                </m:rPr>
+                                <m:t>,</m:t>
+                              </m:r>
+                              <m:r>
+                                <m:t>t</m:t>
+                              </m:r>
+                            </m:sub>
+                            <m:sup>
+                              <m:r>
+                                <m:rPr>
+                                  <w:rFonts w:ascii="Cambria Math" w:hAnsi="Cambria Math" w:eastAsia="Cambria Math" w:cs="Cambria Math"/>
+                                  <m:sty m:val="p"/>
+                                </m:rPr>
+                                <m:t>g</m:t>
+                              </m:r>
+                              <m:r>
+                                <m:rPr>
+                                  <w:rFonts w:ascii="Cambria Math" w:hAnsi="Cambria Math" w:eastAsia="Cambria Math" w:cs="Cambria Math"/>
+                                  <m:sty m:val="p"/>
+                                </m:rPr>
+                                <m:t>,</m:t>
+                              </m:r>
+                              <m:r>
+                                <m:rPr>
+                                  <w:rFonts w:ascii="Cambria Math" w:hAnsi="Cambria Math" w:eastAsia="Cambria Math" w:cs="Cambria Math"/>
+                                  <m:sty m:val="p"/>
+                                </m:rPr>
+                                <m:t>r</m:t>
+                              </m:r>
+                              <m:r>
+                                <m:rPr>
+                                  <w:rFonts w:ascii="Cambria Math" w:hAnsi="Cambria Math" w:eastAsia="Cambria Math" w:cs="Cambria Math"/>
+                                  <m:sty m:val="p"/>
+                                </m:rPr>
+                                <m:t>e</m:t>
+                              </m:r>
+                              <m:r>
+                                <m:rPr>
+                                  <w:rFonts w:ascii="Cambria Math" w:hAnsi="Cambria Math" w:eastAsia="Cambria Math" w:cs="Cambria Math"/>
+                                  <m:sty m:val="p"/>
+                                </m:rPr>
+                                <m:t>a</m:t>
+                              </m:r>
+                              <m:r>
+                                <m:rPr>
+                                  <w:rFonts w:ascii="Cambria Math" w:hAnsi="Cambria Math" w:eastAsia="Cambria Math" w:cs="Cambria Math"/>
+                                  <m:sty m:val="p"/>
+                                </m:rPr>
+                                <m:t>d</m:t>
+                              </m:r>
+                              <m:r>
+                                <m:rPr>
+                                  <w:rFonts w:ascii="Cambria Math" w:hAnsi="Cambria Math" w:eastAsia="Cambria Math" w:cs="Cambria Math"/>
+                                  <m:sty m:val="p"/>
+                                </m:rPr>
+                                <m:t>y</m:t>
+                              </m:r>
+                            </m:sup>
+                          </m:sSubSup>
+                        </m:e>
+                      </m:d>
+                      <m:r>
+                        <m:rPr>
+                          <w:rFonts w:ascii="Cambria Math" w:hAnsi="Cambria Math" w:eastAsia="Cambria Math" w:cs="Cambria Math"/>
+                          <m:sty m:val="p"/>
+                        </m:rPr>
+                        <m:t>.</m:t>
+                      </m:r>
+                    </m:e>
+                  </m:mr>
+                </m:m>
               </m:oMath>
             </m:oMathPara>
           </w:p>
@@ -5470,7 +5642,7 @@
           <w:color w:val="000000"/>
           <w:sz w:val="24"/>
         </w:rPr>
-        <w:t xml:space="preserve">为请求生成时确定的目标补给量，</w:t>
+        <w:t xml:space="preserve">为请求的目标补给量，</w:t>
       </w:r>
       <m:oMath>
         <m:sSubSup>
@@ -5485,7 +5657,21 @@
                 <w:rFonts w:ascii="Cambria Math" w:hAnsi="Cambria Math" w:eastAsia="Cambria Math" w:cs="Cambria Math"/>
                 <m:sty m:val="p"/>
               </m:rPr>
-              <m:t>max</m:t>
+              <m:t>m</m:t>
+            </m:r>
+            <m:r>
+              <m:rPr>
+                <w:rFonts w:ascii="Cambria Math" w:hAnsi="Cambria Math" w:eastAsia="Cambria Math" w:cs="Cambria Math"/>
+                <m:sty m:val="p"/>
+              </m:rPr>
+              <m:t>a</m:t>
+            </m:r>
+            <m:r>
+              <m:rPr>
+                <w:rFonts w:ascii="Cambria Math" w:hAnsi="Cambria Math" w:eastAsia="Cambria Math" w:cs="Cambria Math"/>
+                <m:sty m:val="p"/>
+              </m:rPr>
+              <m:t>x</m:t>
             </m:r>
           </m:sub>
           <m:sup>
@@ -5547,7 +5733,7 @@
           <w:color w:val="000000"/>
           <w:sz w:val="24"/>
         </w:rPr>
-        <w:t xml:space="preserve">L。若该请求在</w:t>
+        <w:t xml:space="preserve">L。若该请求在时刻</w:t>
       </w:r>
       <w:r>
         <w:rPr>
@@ -5635,7 +5821,7 @@
           <w:color w:val="000000"/>
           <w:sz w:val="24"/>
         </w:rPr>
-        <w:t xml:space="preserve">时刻开始服务，则本次服务分配总量</w:t>
+        <w:t xml:space="preserve">开始服务，则在服务开始边界读取当前目标补给量并冻结本次服务分配总量</w:t>
       </w:r>
       <w:r>
         <w:rPr>
@@ -5667,57 +5853,6 @@
             <m:r>
               <m:t>v</m:t>
             </m:r>
-            <m:r>
-              <m:rPr>
-                <w:rFonts w:ascii="Cambria Math" w:hAnsi="Cambria Math" w:eastAsia="Cambria Math" w:cs="Cambria Math"/>
-                <m:sty m:val="p"/>
-              </m:rPr>
-              <m:t>,</m:t>
-            </m:r>
-            <m:sSup>
-              <m:e>
-                <m:r>
-                  <m:t>t</m:t>
-                </m:r>
-              </m:e>
-              <m:sup>
-                <m:r>
-                  <m:rPr>
-                    <w:rFonts w:ascii="Cambria Math" w:hAnsi="Cambria Math" w:eastAsia="Cambria Math" w:cs="Cambria Math"/>
-                    <m:sty m:val="p"/>
-                  </m:rPr>
-                  <m:t>s</m:t>
-                </m:r>
-                <m:r>
-                  <m:rPr>
-                    <w:rFonts w:ascii="Cambria Math" w:hAnsi="Cambria Math" w:eastAsia="Cambria Math" w:cs="Cambria Math"/>
-                    <m:sty m:val="p"/>
-                  </m:rPr>
-                  <m:t>t</m:t>
-                </m:r>
-                <m:r>
-                  <m:rPr>
-                    <w:rFonts w:ascii="Cambria Math" w:hAnsi="Cambria Math" w:eastAsia="Cambria Math" w:cs="Cambria Math"/>
-                    <m:sty m:val="p"/>
-                  </m:rPr>
-                  <m:t>a</m:t>
-                </m:r>
-                <m:r>
-                  <m:rPr>
-                    <w:rFonts w:ascii="Cambria Math" w:hAnsi="Cambria Math" w:eastAsia="Cambria Math" w:cs="Cambria Math"/>
-                    <m:sty m:val="p"/>
-                  </m:rPr>
-                  <m:t>r</m:t>
-                </m:r>
-                <m:r>
-                  <m:rPr>
-                    <w:rFonts w:ascii="Cambria Math" w:hAnsi="Cambria Math" w:eastAsia="Cambria Math" w:cs="Cambria Math"/>
-                    <m:sty m:val="p"/>
-                  </m:rPr>
-                  <m:t>t</m:t>
-                </m:r>
-              </m:sup>
-            </m:sSup>
           </m:sub>
           <m:sup>
             <m:r>
@@ -5760,53 +5895,12 @@
       </m:oMath>
       <w:r>
         <w:rPr>
-          <w:rFonts w:ascii="Times New Roman" w:hAnsi="Times New Roman" w:eastAsia="宋体"/>
-          <w:b w:val="0"/>
-          <w:color w:val="000000"/>
-          <w:sz w:val="24"/>
-        </w:rPr>
-        <w:t xml:space="preserve"> </w:t>
-      </w:r>
-      <w:r>
-        <w:rPr>
           <w:rFonts w:hint="eastAsia" w:ascii="Times New Roman" w:hAnsi="Times New Roman" w:eastAsia="宋体"/>
           <w:b w:val="0"/>
           <w:color w:val="000000"/>
           <w:sz w:val="24"/>
         </w:rPr>
-        <w:t xml:space="preserve">与决策步</w:t>
-      </w:r>
-      <w:r>
-        <w:rPr>
-          <w:rFonts w:ascii="Times New Roman" w:hAnsi="Times New Roman" w:eastAsia="宋体"/>
-          <w:b w:val="0"/>
-          <w:color w:val="000000"/>
-          <w:sz w:val="24"/>
-        </w:rPr>
-        <w:t xml:space="preserve"> </w:t>
-      </w:r>
-      <m:oMath>
-        <m:r>
-          <m:t>t</m:t>
-        </m:r>
-      </m:oMath>
-      <w:r>
-        <w:rPr>
-          <w:rFonts w:ascii="Times New Roman" w:hAnsi="Times New Roman" w:eastAsia="宋体"/>
-          <w:b w:val="0"/>
-          <w:color w:val="000000"/>
-          <w:sz w:val="24"/>
-        </w:rPr>
-        <w:t xml:space="preserve"> </w:t>
-      </w:r>
-      <w:r>
-        <w:rPr>
-          <w:rFonts w:hint="eastAsia" w:ascii="Times New Roman" w:hAnsi="Times New Roman" w:eastAsia="宋体"/>
-          <w:b w:val="0"/>
-          <w:color w:val="000000"/>
-          <w:sz w:val="24"/>
-        </w:rPr>
-        <w:t xml:space="preserve">内的实际转移量</w:t>
+        <w:t xml:space="preserve">，同时以</w:t>
       </w:r>
       <w:r>
         <w:rPr>
@@ -5870,7 +5964,39 @@
           <w:color w:val="000000"/>
           <w:sz w:val="24"/>
         </w:rPr>
-        <w:t xml:space="preserve">定义为</w:t>
+        <w:t xml:space="preserve">表示决策步</w:t>
+      </w:r>
+      <w:r>
+        <w:rPr>
+          <w:rFonts w:ascii="Times New Roman" w:hAnsi="Times New Roman" w:eastAsia="宋体"/>
+          <w:b w:val="0"/>
+          <w:color w:val="000000"/>
+          <w:sz w:val="24"/>
+        </w:rPr>
+        <w:t xml:space="preserve"> </w:t>
+      </w:r>
+      <m:oMath>
+        <m:r>
+          <m:t>t</m:t>
+        </m:r>
+      </m:oMath>
+      <w:r>
+        <w:rPr>
+          <w:rFonts w:ascii="Times New Roman" w:hAnsi="Times New Roman" w:eastAsia="宋体"/>
+          <w:b w:val="0"/>
+          <w:color w:val="000000"/>
+          <w:sz w:val="24"/>
+        </w:rPr>
+        <w:t xml:space="preserve"> </w:t>
+      </w:r>
+      <w:r>
+        <w:rPr>
+          <w:rFonts w:hint="eastAsia" w:ascii="Times New Roman" w:hAnsi="Times New Roman" w:eastAsia="宋体"/>
+          <w:b w:val="0"/>
+          <w:color w:val="000000"/>
+          <w:sz w:val="24"/>
+        </w:rPr>
+        <w:t xml:space="preserve">内的实际转移量，二者定义为</w:t>
       </w:r>
     </w:p>
     <w:tbl>
@@ -5934,57 +6060,6 @@
                         <m:r>
                           <m:t>v</m:t>
                         </m:r>
-                        <m:r>
-                          <m:rPr>
-                            <w:rFonts w:ascii="Cambria Math" w:hAnsi="Cambria Math" w:eastAsia="Cambria Math" w:cs="Cambria Math"/>
-                            <m:sty m:val="p"/>
-                          </m:rPr>
-                          <m:t>,</m:t>
-                        </m:r>
-                        <m:sSup>
-                          <m:e>
-                            <m:r>
-                              <m:t>t</m:t>
-                            </m:r>
-                          </m:e>
-                          <m:sup>
-                            <m:r>
-                              <m:rPr>
-                                <w:rFonts w:ascii="Cambria Math" w:hAnsi="Cambria Math" w:eastAsia="Cambria Math" w:cs="Cambria Math"/>
-                                <m:sty m:val="p"/>
-                              </m:rPr>
-                              <m:t>s</m:t>
-                            </m:r>
-                            <m:r>
-                              <m:rPr>
-                                <w:rFonts w:ascii="Cambria Math" w:hAnsi="Cambria Math" w:eastAsia="Cambria Math" w:cs="Cambria Math"/>
-                                <m:sty m:val="p"/>
-                              </m:rPr>
-                              <m:t>t</m:t>
-                            </m:r>
-                            <m:r>
-                              <m:rPr>
-                                <w:rFonts w:ascii="Cambria Math" w:hAnsi="Cambria Math" w:eastAsia="Cambria Math" w:cs="Cambria Math"/>
-                                <m:sty m:val="p"/>
-                              </m:rPr>
-                              <m:t>a</m:t>
-                            </m:r>
-                            <m:r>
-                              <m:rPr>
-                                <w:rFonts w:ascii="Cambria Math" w:hAnsi="Cambria Math" w:eastAsia="Cambria Math" w:cs="Cambria Math"/>
-                                <m:sty m:val="p"/>
-                              </m:rPr>
-                              <m:t>r</m:t>
-                            </m:r>
-                            <m:r>
-                              <m:rPr>
-                                <w:rFonts w:ascii="Cambria Math" w:hAnsi="Cambria Math" w:eastAsia="Cambria Math" w:cs="Cambria Math"/>
-                                <m:sty m:val="p"/>
-                              </m:rPr>
-                              <m:t>t</m:t>
-                            </m:r>
-                          </m:sup>
-                        </m:sSup>
                       </m:sub>
                       <m:sup>
                         <m:r>
@@ -6066,12 +6141,27 @@
                               </m:rPr>
                               <m:t>,</m:t>
                             </m:r>
-                            <m:sSup>
+                            <m:sSubSup>
                               <m:e>
                                 <m:r>
                                   <m:t>t</m:t>
                                 </m:r>
                               </m:e>
+                              <m:sub>
+                                <m:r>
+                                  <m:t>i</m:t>
+                                </m:r>
+                                <m:r>
+                                  <m:rPr>
+                                    <w:rFonts w:ascii="Cambria Math" w:hAnsi="Cambria Math" w:eastAsia="Cambria Math" w:cs="Cambria Math"/>
+                                    <m:sty m:val="p"/>
+                                  </m:rPr>
+                                  <m:t>,</m:t>
+                                </m:r>
+                                <m:r>
+                                  <m:t>v</m:t>
+                                </m:r>
+                              </m:sub>
                               <m:sup>
                                 <m:r>
                                   <m:rPr>
@@ -6109,7 +6199,7 @@
                                   <m:t>t</m:t>
                                 </m:r>
                               </m:sup>
-                            </m:sSup>
+                            </m:sSubSup>
                           </m:sub>
                           <m:sup>
                             <m:r>
@@ -6162,7 +6252,21 @@
                                 <w:rFonts w:ascii="Cambria Math" w:hAnsi="Cambria Math" w:eastAsia="Cambria Math" w:cs="Cambria Math"/>
                                 <m:sty m:val="p"/>
                               </m:rPr>
-                              <m:t>max</m:t>
+                              <m:t>m</m:t>
+                            </m:r>
+                            <m:r>
+                              <m:rPr>
+                                <w:rFonts w:ascii="Cambria Math" w:hAnsi="Cambria Math" w:eastAsia="Cambria Math" w:cs="Cambria Math"/>
+                                <m:sty m:val="p"/>
+                              </m:rPr>
+                              <m:t>a</m:t>
+                            </m:r>
+                            <m:r>
+                              <m:rPr>
+                                <w:rFonts w:ascii="Cambria Math" w:hAnsi="Cambria Math" w:eastAsia="Cambria Math" w:cs="Cambria Math"/>
+                                <m:sty m:val="p"/>
+                              </m:rPr>
+                              <m:t>x</m:t>
                             </m:r>
                           </m:sup>
                         </m:sSubSup>
@@ -6190,12 +6294,27 @@
                               </m:rPr>
                               <m:t>,</m:t>
                             </m:r>
-                            <m:sSup>
+                            <m:sSubSup>
                               <m:e>
                                 <m:r>
                                   <m:t>t</m:t>
                                 </m:r>
                               </m:e>
+                              <m:sub>
+                                <m:r>
+                                  <m:t>i</m:t>
+                                </m:r>
+                                <m:r>
+                                  <m:rPr>
+                                    <w:rFonts w:ascii="Cambria Math" w:hAnsi="Cambria Math" w:eastAsia="Cambria Math" w:cs="Cambria Math"/>
+                                    <m:sty m:val="p"/>
+                                  </m:rPr>
+                                  <m:t>,</m:t>
+                                </m:r>
+                                <m:r>
+                                  <m:t>v</m:t>
+                                </m:r>
+                              </m:sub>
                               <m:sup>
                                 <m:r>
                                   <m:rPr>
@@ -6233,7 +6352,7 @@
                                   <m:t>t</m:t>
                                 </m:r>
                               </m:sup>
-                            </m:sSup>
+                            </m:sSubSup>
                           </m:sub>
                         </m:sSub>
                         <m:r>
@@ -6263,12 +6382,27 @@
                               </m:rPr>
                               <m:t>,</m:t>
                             </m:r>
-                            <m:sSup>
+                            <m:sSubSup>
                               <m:e>
                                 <m:r>
                                   <m:t>t</m:t>
                                 </m:r>
                               </m:e>
+                              <m:sub>
+                                <m:r>
+                                  <m:t>i</m:t>
+                                </m:r>
+                                <m:r>
+                                  <m:rPr>
+                                    <w:rFonts w:ascii="Cambria Math" w:hAnsi="Cambria Math" w:eastAsia="Cambria Math" w:cs="Cambria Math"/>
+                                    <m:sty m:val="p"/>
+                                  </m:rPr>
+                                  <m:t>,</m:t>
+                                </m:r>
+                                <m:r>
+                                  <m:t>v</m:t>
+                                </m:r>
+                              </m:sub>
                               <m:sup>
                                 <m:r>
                                   <m:rPr>
@@ -6306,7 +6440,7 @@
                                   <m:t>t</m:t>
                                 </m:r>
                               </m:sup>
-                            </m:sSup>
+                            </m:sSubSup>
                           </m:sub>
                         </m:sSub>
                         <m:r>
@@ -6331,7 +6465,21 @@
                                 <w:rFonts w:ascii="Cambria Math" w:hAnsi="Cambria Math" w:eastAsia="Cambria Math" w:cs="Cambria Math"/>
                                 <m:sty m:val="p"/>
                               </m:rPr>
-                              <m:t>max</m:t>
+                              <m:t>m</m:t>
+                            </m:r>
+                            <m:r>
+                              <m:rPr>
+                                <w:rFonts w:ascii="Cambria Math" w:hAnsi="Cambria Math" w:eastAsia="Cambria Math" w:cs="Cambria Math"/>
+                                <m:sty m:val="p"/>
+                              </m:rPr>
+                              <m:t>a</m:t>
+                            </m:r>
+                            <m:r>
+                              <m:rPr>
+                                <w:rFonts w:ascii="Cambria Math" w:hAnsi="Cambria Math" w:eastAsia="Cambria Math" w:cs="Cambria Math"/>
+                                <m:sty m:val="p"/>
+                              </m:rPr>
+                              <m:t>x</m:t>
                             </m:r>
                           </m:sub>
                           <m:sup>
@@ -6417,6 +6565,11 @@
                     <m:sSubSup>
                       <m:e>
                         <m:r>
+                          <m:rPr>
+                            <w:rFonts w:ascii="Cambria Math" w:hAnsi="Cambria Math" w:eastAsia="Cambria Math" w:cs="Cambria Math"/>
+                            <m:scr m:val="double-struck"/>
+                            <m:sty m:val="p"/>
+                          </m:rPr>
                           <m:t>I</m:t>
                         </m:r>
                       </m:e>
@@ -6507,57 +6660,6 @@
                                     <m:r>
                                       <m:t>v</m:t>
                                     </m:r>
-                                    <m:r>
-                                      <m:rPr>
-                                        <w:rFonts w:ascii="Cambria Math" w:hAnsi="Cambria Math" w:eastAsia="Cambria Math" w:cs="Cambria Math"/>
-                                        <m:sty m:val="p"/>
-                                      </m:rPr>
-                                      <m:t>,</m:t>
-                                    </m:r>
-                                    <m:sSup>
-                                      <m:e>
-                                        <m:r>
-                                          <m:t>t</m:t>
-                                        </m:r>
-                                      </m:e>
-                                      <m:sup>
-                                        <m:r>
-                                          <m:rPr>
-                                            <w:rFonts w:ascii="Cambria Math" w:hAnsi="Cambria Math" w:eastAsia="Cambria Math" w:cs="Cambria Math"/>
-                                            <m:sty m:val="p"/>
-                                          </m:rPr>
-                                          <m:t>s</m:t>
-                                        </m:r>
-                                        <m:r>
-                                          <m:rPr>
-                                            <w:rFonts w:ascii="Cambria Math" w:hAnsi="Cambria Math" w:eastAsia="Cambria Math" w:cs="Cambria Math"/>
-                                            <m:sty m:val="p"/>
-                                          </m:rPr>
-                                          <m:t>t</m:t>
-                                        </m:r>
-                                        <m:r>
-                                          <m:rPr>
-                                            <w:rFonts w:ascii="Cambria Math" w:hAnsi="Cambria Math" w:eastAsia="Cambria Math" w:cs="Cambria Math"/>
-                                            <m:sty m:val="p"/>
-                                          </m:rPr>
-                                          <m:t>a</m:t>
-                                        </m:r>
-                                        <m:r>
-                                          <m:rPr>
-                                            <w:rFonts w:ascii="Cambria Math" w:hAnsi="Cambria Math" w:eastAsia="Cambria Math" w:cs="Cambria Math"/>
-                                            <m:sty m:val="p"/>
-                                          </m:rPr>
-                                          <m:t>r</m:t>
-                                        </m:r>
-                                        <m:r>
-                                          <m:rPr>
-                                            <w:rFonts w:ascii="Cambria Math" w:hAnsi="Cambria Math" w:eastAsia="Cambria Math" w:cs="Cambria Math"/>
-                                            <m:sty m:val="p"/>
-                                          </m:rPr>
-                                          <m:t>t</m:t>
-                                        </m:r>
-                                      </m:sup>
-                                    </m:sSup>
                                   </m:sub>
                                   <m:sup>
                                     <m:r>
@@ -6889,6 +6991,11 @@
         <m:sSubSup>
           <m:e>
             <m:r>
+              <m:rPr>
+                <w:rFonts w:ascii="Cambria Math" w:hAnsi="Cambria Math" w:eastAsia="Cambria Math" w:cs="Cambria Math"/>
+                <m:scr m:val="double-struck"/>
+                <m:sty m:val="p"/>
+              </m:rPr>
               <m:t>I</m:t>
             </m:r>
           </m:e>
@@ -7208,57 +7315,6 @@
             <m:r>
               <m:t>v</m:t>
             </m:r>
-            <m:r>
-              <m:rPr>
-                <w:rFonts w:ascii="Cambria Math" w:hAnsi="Cambria Math" w:eastAsia="Cambria Math" w:cs="Cambria Math"/>
-                <m:sty m:val="p"/>
-              </m:rPr>
-              <m:t>,</m:t>
-            </m:r>
-            <m:sSup>
-              <m:e>
-                <m:r>
-                  <m:t>t</m:t>
-                </m:r>
-              </m:e>
-              <m:sup>
-                <m:r>
-                  <m:rPr>
-                    <w:rFonts w:ascii="Cambria Math" w:hAnsi="Cambria Math" w:eastAsia="Cambria Math" w:cs="Cambria Math"/>
-                    <m:sty m:val="p"/>
-                  </m:rPr>
-                  <m:t>s</m:t>
-                </m:r>
-                <m:r>
-                  <m:rPr>
-                    <w:rFonts w:ascii="Cambria Math" w:hAnsi="Cambria Math" w:eastAsia="Cambria Math" w:cs="Cambria Math"/>
-                    <m:sty m:val="p"/>
-                  </m:rPr>
-                  <m:t>t</m:t>
-                </m:r>
-                <m:r>
-                  <m:rPr>
-                    <w:rFonts w:ascii="Cambria Math" w:hAnsi="Cambria Math" w:eastAsia="Cambria Math" w:cs="Cambria Math"/>
-                    <m:sty m:val="p"/>
-                  </m:rPr>
-                  <m:t>a</m:t>
-                </m:r>
-                <m:r>
-                  <m:rPr>
-                    <w:rFonts w:ascii="Cambria Math" w:hAnsi="Cambria Math" w:eastAsia="Cambria Math" w:cs="Cambria Math"/>
-                    <m:sty m:val="p"/>
-                  </m:rPr>
-                  <m:t>r</m:t>
-                </m:r>
-                <m:r>
-                  <m:rPr>
-                    <w:rFonts w:ascii="Cambria Math" w:hAnsi="Cambria Math" w:eastAsia="Cambria Math" w:cs="Cambria Math"/>
-                    <m:sty m:val="p"/>
-                  </m:rPr>
-                  <m:t>t</m:t>
-                </m:r>
-              </m:sup>
-            </m:sSup>
           </m:sub>
           <m:sup>
             <m:r>
@@ -7720,6 +7776,11 @@
         <m:sSubSup>
           <m:e>
             <m:r>
+              <m:rPr>
+                <w:rFonts w:ascii="Cambria Math" w:hAnsi="Cambria Math" w:eastAsia="Cambria Math" w:cs="Cambria Math"/>
+                <m:scr m:val="double-struck"/>
+                <m:sty m:val="p"/>
+              </m:rPr>
               <m:t>I</m:t>
             </m:r>
           </m:e>
@@ -8319,7 +8380,21 @@
                             <w:rFonts w:ascii="Cambria Math" w:hAnsi="Cambria Math" w:eastAsia="Cambria Math" w:cs="Cambria Math"/>
                             <m:sty m:val="p"/>
                           </m:rPr>
-                          <m:t>max</m:t>
+                          <m:t>m</m:t>
+                        </m:r>
+                        <m:r>
+                          <m:rPr>
+                            <w:rFonts w:ascii="Cambria Math" w:hAnsi="Cambria Math" w:eastAsia="Cambria Math" w:cs="Cambria Math"/>
+                            <m:sty m:val="p"/>
+                          </m:rPr>
+                          <m:t>a</m:t>
+                        </m:r>
+                        <m:r>
+                          <m:rPr>
+                            <w:rFonts w:ascii="Cambria Math" w:hAnsi="Cambria Math" w:eastAsia="Cambria Math" w:cs="Cambria Math"/>
+                            <m:sty m:val="p"/>
+                          </m:rPr>
+                          <m:t>x</m:t>
                         </m:r>
                       </m:sup>
                     </m:sSubSup>
@@ -8481,6 +8556,11 @@
                         <m:sSubSup>
                           <m:e>
                             <m:r>
+                              <m:rPr>
+                                <w:rFonts w:ascii="Cambria Math" w:hAnsi="Cambria Math" w:eastAsia="Cambria Math" w:cs="Cambria Math"/>
+                                <m:scr m:val="double-struck"/>
+                                <m:sty m:val="p"/>
+                              </m:rPr>
                               <m:t>I</m:t>
                             </m:r>
                           </m:e>
@@ -8594,6 +8674,11 @@
                         <m:sSubSup>
                           <m:e>
                             <m:r>
+                              <m:rPr>
+                                <w:rFonts w:ascii="Cambria Math" w:hAnsi="Cambria Math" w:eastAsia="Cambria Math" w:cs="Cambria Math"/>
+                                <m:scr m:val="double-struck"/>
+                                <m:sty m:val="p"/>
+                              </m:rPr>
                               <m:t>I</m:t>
                             </m:r>
                           </m:e>
@@ -8742,57 +8827,6 @@
                         <m:r>
                           <m:t>v</m:t>
                         </m:r>
-                        <m:r>
-                          <m:rPr>
-                            <w:rFonts w:ascii="Cambria Math" w:hAnsi="Cambria Math" w:eastAsia="Cambria Math" w:cs="Cambria Math"/>
-                            <m:sty m:val="p"/>
-                          </m:rPr>
-                          <m:t>,</m:t>
-                        </m:r>
-                        <m:sSup>
-                          <m:e>
-                            <m:r>
-                              <m:t>t</m:t>
-                            </m:r>
-                          </m:e>
-                          <m:sup>
-                            <m:r>
-                              <m:rPr>
-                                <w:rFonts w:ascii="Cambria Math" w:hAnsi="Cambria Math" w:eastAsia="Cambria Math" w:cs="Cambria Math"/>
-                                <m:sty m:val="p"/>
-                              </m:rPr>
-                              <m:t>s</m:t>
-                            </m:r>
-                            <m:r>
-                              <m:rPr>
-                                <w:rFonts w:ascii="Cambria Math" w:hAnsi="Cambria Math" w:eastAsia="Cambria Math" w:cs="Cambria Math"/>
-                                <m:sty m:val="p"/>
-                              </m:rPr>
-                              <m:t>t</m:t>
-                            </m:r>
-                            <m:r>
-                              <m:rPr>
-                                <w:rFonts w:ascii="Cambria Math" w:hAnsi="Cambria Math" w:eastAsia="Cambria Math" w:cs="Cambria Math"/>
-                                <m:sty m:val="p"/>
-                              </m:rPr>
-                              <m:t>a</m:t>
-                            </m:r>
-                            <m:r>
-                              <m:rPr>
-                                <w:rFonts w:ascii="Cambria Math" w:hAnsi="Cambria Math" w:eastAsia="Cambria Math" w:cs="Cambria Math"/>
-                                <m:sty m:val="p"/>
-                              </m:rPr>
-                              <m:t>r</m:t>
-                            </m:r>
-                            <m:r>
-                              <m:rPr>
-                                <w:rFonts w:ascii="Cambria Math" w:hAnsi="Cambria Math" w:eastAsia="Cambria Math" w:cs="Cambria Math"/>
-                                <m:sty m:val="p"/>
-                              </m:rPr>
-                              <m:t>t</m:t>
-                            </m:r>
-                          </m:sup>
-                        </m:sSup>
                       </m:sub>
                       <m:sup>
                         <m:r>
@@ -9698,6 +9732,10 @@
           </m:sub>
           <m:sup>
             <m:r>
+              <m:rPr>
+                <w:rFonts w:ascii="Cambria Math" w:hAnsi="Cambria Math" w:eastAsia="Cambria Math" w:cs="Cambria Math"/>
+                <m:sty m:val="p"/>
+              </m:rPr>
               <m:t>u</m:t>
             </m:r>
           </m:sup>
@@ -9739,6 +9777,10 @@
           </m:e>
           <m:sup>
             <m:r>
+              <m:rPr>
+                <w:rFonts w:ascii="Cambria Math" w:hAnsi="Cambria Math" w:eastAsia="Cambria Math" w:cs="Cambria Math"/>
+                <m:sty m:val="p"/>
+              </m:rPr>
               <m:t>g</m:t>
             </m:r>
           </m:sup>
@@ -9821,6 +9863,10 @@
           </m:e>
           <m:sup>
             <m:r>
+              <m:rPr>
+                <w:rFonts w:ascii="Cambria Math" w:hAnsi="Cambria Math" w:eastAsia="Cambria Math" w:cs="Cambria Math"/>
+                <m:sty m:val="p"/>
+              </m:rPr>
               <m:t>u</m:t>
             </m:r>
             <m:r>
@@ -9890,6 +9936,10 @@
           </m:e>
           <m:sup>
             <m:r>
+              <m:rPr>
+                <w:rFonts w:ascii="Cambria Math" w:hAnsi="Cambria Math" w:eastAsia="Cambria Math" w:cs="Cambria Math"/>
+                <m:sty m:val="p"/>
+              </m:rPr>
               <m:t>g</m:t>
             </m:r>
             <m:r>
@@ -10240,6 +10290,10 @@
           </m:sub>
           <m:sup>
             <m:r>
+              <m:rPr>
+                <w:rFonts w:ascii="Cambria Math" w:hAnsi="Cambria Math" w:eastAsia="Cambria Math" w:cs="Cambria Math"/>
+                <m:sty m:val="p"/>
+              </m:rPr>
               <m:t>u</m:t>
             </m:r>
           </m:sup>
@@ -10275,6 +10329,10 @@
           </m:sub>
           <m:sup>
             <m:r>
+              <m:rPr>
+                <w:rFonts w:ascii="Cambria Math" w:hAnsi="Cambria Math" w:eastAsia="Cambria Math" w:cs="Cambria Math"/>
+                <m:sty m:val="p"/>
+              </m:rPr>
               <m:t>u</m:t>
             </m:r>
           </m:sup>
@@ -10294,6 +10352,10 @@
           </m:e>
           <m:sup>
             <m:r>
+              <m:rPr>
+                <w:rFonts w:ascii="Cambria Math" w:hAnsi="Cambria Math" w:eastAsia="Cambria Math" w:cs="Cambria Math"/>
+                <m:sty m:val="p"/>
+              </m:rPr>
               <m:t>u</m:t>
             </m:r>
             <m:r>
@@ -10352,6 +10414,10 @@
           </m:e>
           <m:sup>
             <m:r>
+              <m:rPr>
+                <w:rFonts w:ascii="Cambria Math" w:hAnsi="Cambria Math" w:eastAsia="Cambria Math" w:cs="Cambria Math"/>
+                <m:sty m:val="p"/>
+              </m:rPr>
               <m:t>g</m:t>
             </m:r>
           </m:sup>
@@ -10371,6 +10437,10 @@
           </m:e>
           <m:sup>
             <m:r>
+              <m:rPr>
+                <w:rFonts w:ascii="Cambria Math" w:hAnsi="Cambria Math" w:eastAsia="Cambria Math" w:cs="Cambria Math"/>
+                <m:sty m:val="p"/>
+              </m:rPr>
               <m:t>g</m:t>
             </m:r>
           </m:sup>
@@ -10390,6 +10460,10 @@
           </m:e>
           <m:sup>
             <m:r>
+              <m:rPr>
+                <w:rFonts w:ascii="Cambria Math" w:hAnsi="Cambria Math" w:eastAsia="Cambria Math" w:cs="Cambria Math"/>
+                <m:sty m:val="p"/>
+              </m:rPr>
               <m:t>g</m:t>
             </m:r>
             <m:r>
@@ -10818,6 +10892,10 @@
                       </m:sub>
                       <m:sup>
                         <m:r>
+                          <m:rPr>
+                            <w:rFonts w:ascii="Cambria Math" w:hAnsi="Cambria Math" w:eastAsia="Cambria Math" w:cs="Cambria Math"/>
+                            <m:sty m:val="p"/>
+                          </m:rPr>
                           <m:t>u</m:t>
                         </m:r>
                       </m:sup>
@@ -10856,6 +10934,10 @@
                       </m:e>
                       <m:sup>
                         <m:r>
+                          <m:rPr>
+                            <w:rFonts w:ascii="Cambria Math" w:hAnsi="Cambria Math" w:eastAsia="Cambria Math" w:cs="Cambria Math"/>
+                            <m:sty m:val="p"/>
+                          </m:rPr>
                           <m:t>g</m:t>
                         </m:r>
                       </m:sup>

</xml_diff>